<commit_message>
despliegue de app django
</commit_message>
<xml_diff>
--- a/Flujo aplicación UROMED.docx
+++ b/Flujo aplicación UROMED.docx
@@ -1,6 +1,6 @@
 
 <file path=word/document.xml><?xml version="1.0" encoding="utf-8"?>
-<w:document xmlns:wpc="http://schemas.microsoft.com/office/word/2010/wordprocessingCanvas" xmlns:cx="http://schemas.microsoft.com/office/drawing/2014/chartex" xmlns:cx1="http://schemas.microsoft.com/office/drawing/2015/9/8/chartex" xmlns:cx2="http://schemas.microsoft.com/office/drawing/2015/10/21/chartex" xmlns:cx3="http://schemas.microsoft.com/office/drawing/2016/5/9/chartex" xmlns:cx4="http://schemas.microsoft.com/office/drawing/2016/5/10/chartex" xmlns:cx5="http://schemas.microsoft.com/office/drawing/2016/5/11/chartex" xmlns:cx6="http://schemas.microsoft.com/office/drawing/2016/5/12/chartex" xmlns:cx7="http://schemas.microsoft.com/office/drawing/2016/5/13/chartex" xmlns:cx8="http://schemas.microsoft.com/office/drawing/2016/5/14/chartex" xmlns:mc="http://schemas.openxmlformats.org/markup-compatibility/2006" xmlns:aink="http://schemas.microsoft.com/office/drawing/2016/ink" xmlns:am3d="http://schemas.microsoft.com/office/drawing/2017/model3d" xmlns:o="urn:schemas-microsoft-com:office:office" xmlns:oel="http://schemas.microsoft.com/office/2019/extlst" xmlns:r="http://schemas.openxmlformats.org/officeDocument/2006/relationships" xmlns:m="http://schemas.openxmlformats.org/officeDocument/2006/math" xmlns:v="urn:schemas-microsoft-com:vml" xmlns:wp14="http://schemas.microsoft.com/office/word/2010/wordprocessingDrawing" xmlns:wp="http://schemas.openxmlformats.org/drawingml/2006/wordprocessingDrawing" xmlns:w10="urn:schemas-microsoft-com:office:word" xmlns:w="http://schemas.openxmlformats.org/wordprocessingml/2006/main" xmlns:w14="http://schemas.microsoft.com/office/word/2010/wordml" xmlns:w15="http://schemas.microsoft.com/office/word/2012/wordml" xmlns:w16cex="http://schemas.microsoft.com/office/word/2018/wordml/cex" xmlns:w16cid="http://schemas.microsoft.com/office/word/2016/wordml/cid" xmlns:w16="http://schemas.microsoft.com/office/word/2018/wordml" xmlns:w16du="http://schemas.microsoft.com/office/word/2023/wordml/word16du" xmlns:w16sdtdh="http://schemas.microsoft.com/office/word/2020/wordml/sdtdatahash" xmlns:w16se="http://schemas.microsoft.com/office/word/2015/wordml/symex" xmlns:wpg="http://schemas.microsoft.com/office/word/2010/wordprocessingGroup" xmlns:wpi="http://schemas.microsoft.com/office/word/2010/wordprocessingInk" xmlns:wne="http://schemas.microsoft.com/office/word/2006/wordml" xmlns:wps="http://schemas.microsoft.com/office/word/2010/wordprocessingShape" mc:Ignorable="w14 w15 w16se w16cid w16 w16cex w16sdtdh w16du wp14">
+<w:document xmlns:wpc="http://schemas.microsoft.com/office/word/2010/wordprocessingCanvas" xmlns:cx="http://schemas.microsoft.com/office/drawing/2014/chartex" xmlns:cx1="http://schemas.microsoft.com/office/drawing/2015/9/8/chartex" xmlns:cx2="http://schemas.microsoft.com/office/drawing/2015/10/21/chartex" xmlns:cx3="http://schemas.microsoft.com/office/drawing/2016/5/9/chartex" xmlns:cx4="http://schemas.microsoft.com/office/drawing/2016/5/10/chartex" xmlns:cx5="http://schemas.microsoft.com/office/drawing/2016/5/11/chartex" xmlns:cx6="http://schemas.microsoft.com/office/drawing/2016/5/12/chartex" xmlns:cx7="http://schemas.microsoft.com/office/drawing/2016/5/13/chartex" xmlns:cx8="http://schemas.microsoft.com/office/drawing/2016/5/14/chartex" xmlns:mc="http://schemas.openxmlformats.org/markup-compatibility/2006" xmlns:aink="http://schemas.microsoft.com/office/drawing/2016/ink" xmlns:am3d="http://schemas.microsoft.com/office/drawing/2017/model3d" xmlns:o="urn:schemas-microsoft-com:office:office" xmlns:oel="http://schemas.microsoft.com/office/2019/extlst" xmlns:r="http://schemas.openxmlformats.org/officeDocument/2006/relationships" xmlns:m="http://schemas.openxmlformats.org/officeDocument/2006/math" xmlns:v="urn:schemas-microsoft-com:vml" xmlns:wp14="http://schemas.microsoft.com/office/word/2010/wordprocessingDrawing" xmlns:wp="http://schemas.openxmlformats.org/drawingml/2006/wordprocessingDrawing" xmlns:w10="urn:schemas-microsoft-com:office:word" xmlns:w="http://schemas.openxmlformats.org/wordprocessingml/2006/main" xmlns:w14="http://schemas.microsoft.com/office/word/2010/wordml" xmlns:w15="http://schemas.microsoft.com/office/word/2012/wordml" xmlns:w16cex="http://schemas.microsoft.com/office/word/2018/wordml/cex" xmlns:w16cid="http://schemas.microsoft.com/office/word/2016/wordml/cid" xmlns:w16="http://schemas.microsoft.com/office/word/2018/wordml" xmlns:w16du="http://schemas.microsoft.com/office/word/2023/wordml/word16du" xmlns:w16sdtdh="http://schemas.microsoft.com/office/word/2020/wordml/sdtdatahash" xmlns:w16sdtfl="http://schemas.microsoft.com/office/word/2024/wordml/sdtformatlock" xmlns:w16se="http://schemas.microsoft.com/office/word/2015/wordml/symex" xmlns:wpg="http://schemas.microsoft.com/office/word/2010/wordprocessingGroup" xmlns:wpi="http://schemas.microsoft.com/office/word/2010/wordprocessingInk" xmlns:wne="http://schemas.microsoft.com/office/word/2006/wordml" xmlns:wps="http://schemas.microsoft.com/office/word/2010/wordprocessingShape" mc:Ignorable="w14 w15 w16se w16cid w16 w16cex w16sdtdh w16sdtfl w16du wp14">
   <w:body>
     <w:p>
       <w:pPr>
@@ -84,10 +84,10 @@
         </w:rPr>
         <w:lastRenderedPageBreak/>
         <w:drawing>
-          <wp:inline distT="0" distB="0" distL="0" distR="0" wp14:anchorId="60300204" wp14:editId="6B3D5546">
-            <wp:extent cx="5612130" cy="3155315"/>
-            <wp:effectExtent l="0" t="0" r="7620" b="6985"/>
-            <wp:docPr id="1492658220" name="Imagen 1"/>
+          <wp:inline distT="0" distB="0" distL="0" distR="0" wp14:anchorId="4B9ECD4B" wp14:editId="4303CA6A">
+            <wp:extent cx="5612130" cy="2545080"/>
+            <wp:effectExtent l="0" t="0" r="7620" b="7620"/>
+            <wp:docPr id="814995726" name="Imagen 1"/>
             <wp:cNvGraphicFramePr>
               <a:graphicFrameLocks xmlns:a="http://schemas.openxmlformats.org/drawingml/2006/main" noChangeAspect="1"/>
             </wp:cNvGraphicFramePr>
@@ -95,7 +95,7 @@
               <a:graphicData uri="http://schemas.openxmlformats.org/drawingml/2006/picture">
                 <pic:pic xmlns:pic="http://schemas.openxmlformats.org/drawingml/2006/picture">
                   <pic:nvPicPr>
-                    <pic:cNvPr id="1492658220" name=""/>
+                    <pic:cNvPr id="814995726" name=""/>
                     <pic:cNvPicPr/>
                   </pic:nvPicPr>
                   <pic:blipFill>
@@ -107,7 +107,7 @@
                   <pic:spPr>
                     <a:xfrm>
                       <a:off x="0" y="0"/>
-                      <a:ext cx="5612130" cy="3155315"/>
+                      <a:ext cx="5612130" cy="2545080"/>
                     </a:xfrm>
                     <a:prstGeom prst="rect">
                       <a:avLst/>
@@ -128,35 +128,42 @@
         <w:t>Una vez ingresa el usuario con sus credenciales de usuario validadas y autenticadas, se tiene esta pantalla principal</w:t>
       </w:r>
       <w:r>
-        <w:t>, que viene siendo la vista de todos los pacientes registrados en la aplicación. Por el momento solo existen 2 usuarios, como se ve en pantalla, ya que es solo para hacer pruebas. Los datos mostrados en la tabla son solo de demostración. Se puede detallar qué datos son más importantes para el médico. Por ejemplo, personalmente reemplazaría el número de teléfono por el RUT, que considero que es más valioso para esta aplicación. Por favor definir esto claramente para que quede establecido, por el momento está así simplemente.</w:t>
-      </w:r>
-    </w:p>
-    <w:p>
-      <w:pPr>
-        <w:jc w:val="both"/>
-      </w:pPr>
-    </w:p>
-    <w:p>
-      <w:pPr>
-        <w:jc w:val="both"/>
-      </w:pPr>
-    </w:p>
-    <w:p>
-      <w:pPr>
-        <w:jc w:val="both"/>
-      </w:pPr>
+        <w:t xml:space="preserve">, que viene siendo la vista de todos los pacientes registrados en la aplicación. Por el momento solo existe </w:t>
+      </w:r>
+      <w:r>
+        <w:t>1</w:t>
+      </w:r>
+      <w:r>
+        <w:t xml:space="preserve"> usuario, como se ve en pantalla, ya que es solo para hacer pruebas. Los datos mostrados en la tabla son solo de demostración. </w:t>
+      </w:r>
+      <w:r>
+        <w:t>Se integra el campo de RUT y el filtro para encontrar los pacientes el por el RUT, considerando los comentarios.</w:t>
+      </w:r>
+    </w:p>
+    <w:p>
+      <w:pPr>
+        <w:jc w:val="both"/>
+      </w:pPr>
+      <w:r>
+        <w:t xml:space="preserve">Luego, al momento de </w:t>
+      </w:r>
+      <w:r>
+        <w:t>hacer clic</w:t>
+      </w:r>
+      <w:r>
+        <w:t xml:space="preserve"> en el botón ‘Ver detalles’, se navega hacia una nueva pantalla, con datos del paciente, con muchos más detalles. En primera instancia se muestran los datos personales del paciente, como se ve en la pantalla.</w:t>
+      </w:r>
     </w:p>
     <w:p>
       <w:r>
         <w:rPr>
           <w:noProof/>
         </w:rPr>
-        <w:lastRenderedPageBreak/>
         <w:drawing>
-          <wp:inline distT="0" distB="0" distL="0" distR="0" wp14:anchorId="685A8503" wp14:editId="3B881D11">
-            <wp:extent cx="5612130" cy="3155315"/>
-            <wp:effectExtent l="0" t="0" r="7620" b="6985"/>
-            <wp:docPr id="273425505" name="Imagen 1"/>
+          <wp:inline distT="0" distB="0" distL="0" distR="0" wp14:anchorId="5E07327C" wp14:editId="0963FF72">
+            <wp:extent cx="5612130" cy="2550795"/>
+            <wp:effectExtent l="0" t="0" r="7620" b="1905"/>
+            <wp:docPr id="1227798447" name="Imagen 1"/>
             <wp:cNvGraphicFramePr>
               <a:graphicFrameLocks xmlns:a="http://schemas.openxmlformats.org/drawingml/2006/main" noChangeAspect="1"/>
             </wp:cNvGraphicFramePr>
@@ -164,7 +171,7 @@
               <a:graphicData uri="http://schemas.openxmlformats.org/drawingml/2006/picture">
                 <pic:pic xmlns:pic="http://schemas.openxmlformats.org/drawingml/2006/picture">
                   <pic:nvPicPr>
-                    <pic:cNvPr id="273425505" name=""/>
+                    <pic:cNvPr id="1227798447" name=""/>
                     <pic:cNvPicPr/>
                   </pic:nvPicPr>
                   <pic:blipFill>
@@ -176,7 +183,7 @@
                   <pic:spPr>
                     <a:xfrm>
                       <a:off x="0" y="0"/>
-                      <a:ext cx="5612130" cy="3155315"/>
+                      <a:ext cx="5612130" cy="2550795"/>
                     </a:xfrm>
                     <a:prstGeom prst="rect">
                       <a:avLst/>
@@ -194,12 +201,7 @@
         <w:jc w:val="both"/>
       </w:pPr>
       <w:r>
-        <w:t>Además, se tiene un filtro por nombre para encontrar más rápidamente a los usuarios. Por el momento solo existe el filtro de nombre, pero claramente se puede filtrar por el RUT o cualquier otro dato. Es importante que esto también quede establecido. Me refiero a qué datos quieren usar como filtros para acceder más rápido al paciente.</w:t>
-      </w:r>
-    </w:p>
-    <w:p>
-      <w:r>
-        <w:t>Luego, al momento de pinchar en el botón ‘Ver detalles’, se navega hacia una nueva pantalla, con datos del paciente, con muchos más detalles. En primera instancia se muestran los datos personales del paciente, como se ve en la pantalla.</w:t>
+        <w:t>Se integran nuevos campos, como el trabajo / oficio a realizar y la empresa en la cual va a desempeñar la actividad el paciente.</w:t>
       </w:r>
     </w:p>
     <w:p>
@@ -207,11 +209,12 @@
         <w:rPr>
           <w:noProof/>
         </w:rPr>
+        <w:lastRenderedPageBreak/>
         <w:drawing>
-          <wp:inline distT="0" distB="0" distL="0" distR="0" wp14:anchorId="61EFC7EC" wp14:editId="52C126A1">
-            <wp:extent cx="5612130" cy="3155315"/>
-            <wp:effectExtent l="0" t="0" r="7620" b="6985"/>
-            <wp:docPr id="238271880" name="Imagen 1"/>
+          <wp:inline distT="0" distB="0" distL="0" distR="0" wp14:anchorId="2146AE7A" wp14:editId="6D2D9496">
+            <wp:extent cx="5612130" cy="2560955"/>
+            <wp:effectExtent l="0" t="0" r="7620" b="0"/>
+            <wp:docPr id="155310656" name="Imagen 1"/>
             <wp:cNvGraphicFramePr>
               <a:graphicFrameLocks xmlns:a="http://schemas.openxmlformats.org/drawingml/2006/main" noChangeAspect="1"/>
             </wp:cNvGraphicFramePr>
@@ -219,7 +222,7 @@
               <a:graphicData uri="http://schemas.openxmlformats.org/drawingml/2006/picture">
                 <pic:pic xmlns:pic="http://schemas.openxmlformats.org/drawingml/2006/picture">
                   <pic:nvPicPr>
-                    <pic:cNvPr id="238271880" name=""/>
+                    <pic:cNvPr id="155310656" name=""/>
                     <pic:cNvPicPr/>
                   </pic:nvPicPr>
                   <pic:blipFill>
@@ -231,7 +234,7 @@
                   <pic:spPr>
                     <a:xfrm>
                       <a:off x="0" y="0"/>
-                      <a:ext cx="5612130" cy="3155315"/>
+                      <a:ext cx="5612130" cy="2560955"/>
                     </a:xfrm>
                     <a:prstGeom prst="rect">
                       <a:avLst/>
@@ -245,16 +248,34 @@
       </w:r>
     </w:p>
     <w:p>
+      <w:pPr>
+        <w:jc w:val="both"/>
+      </w:pPr>
+      <w:r>
+        <w:t>La segunda pestaña de ‘signos vitales’ queda de la siguiente manera considerando los comentarios hechos en el último feedback.</w:t>
+      </w:r>
+    </w:p>
+    <w:p>
+      <w:pPr>
+        <w:jc w:val="both"/>
+      </w:pPr>
+      <w:r>
+        <w:t>Esto también queda a criterio del médico, ya que él es quien decide que quiere ver en esta pantalla, el objetivo es que puedan indicarme qué es lo que quieren ver acá y qué tipo de datos les son más útiles. Se debe definir rápidamente, con la intención de acelerar el proceso y evitar el re trabajo. Obviamente priorizar el hacer esto una sola vez y no iterar tantas veces en esta pantalla.</w:t>
+      </w:r>
+    </w:p>
+    <w:p>
+      <w:pPr>
+        <w:jc w:val="both"/>
+      </w:pPr>
       <w:r>
         <w:rPr>
           <w:noProof/>
         </w:rPr>
-        <w:lastRenderedPageBreak/>
         <w:drawing>
-          <wp:inline distT="0" distB="0" distL="0" distR="0" wp14:anchorId="79C4E15F" wp14:editId="60813DCC">
-            <wp:extent cx="5612130" cy="3155315"/>
-            <wp:effectExtent l="0" t="0" r="7620" b="6985"/>
-            <wp:docPr id="52665646" name="Imagen 1"/>
+          <wp:inline distT="0" distB="0" distL="0" distR="0" wp14:anchorId="2B639755" wp14:editId="3D2DC403">
+            <wp:extent cx="5612130" cy="2558415"/>
+            <wp:effectExtent l="0" t="0" r="7620" b="0"/>
+            <wp:docPr id="484601270" name="Imagen 1"/>
             <wp:cNvGraphicFramePr>
               <a:graphicFrameLocks xmlns:a="http://schemas.openxmlformats.org/drawingml/2006/main" noChangeAspect="1"/>
             </wp:cNvGraphicFramePr>
@@ -262,7 +283,7 @@
               <a:graphicData uri="http://schemas.openxmlformats.org/drawingml/2006/picture">
                 <pic:pic xmlns:pic="http://schemas.openxmlformats.org/drawingml/2006/picture">
                   <pic:nvPicPr>
-                    <pic:cNvPr id="52665646" name=""/>
+                    <pic:cNvPr id="484601270" name=""/>
                     <pic:cNvPicPr/>
                   </pic:nvPicPr>
                   <pic:blipFill>
@@ -274,7 +295,7 @@
                   <pic:spPr>
                     <a:xfrm>
                       <a:off x="0" y="0"/>
-                      <a:ext cx="5612130" cy="3155315"/>
+                      <a:ext cx="5612130" cy="2558415"/>
                     </a:xfrm>
                     <a:prstGeom prst="rect">
                       <a:avLst/>
@@ -292,29 +313,11 @@
         <w:jc w:val="both"/>
       </w:pPr>
       <w:r>
-        <w:t xml:space="preserve">Además, es posible navegar por las distintas pestañas de esta pantalla, por ejemplo, el segundo </w:t>
-      </w:r>
-      <w:proofErr w:type="spellStart"/>
-      <w:r>
-        <w:t>tab</w:t>
-      </w:r>
-      <w:proofErr w:type="spellEnd"/>
-      <w:r>
-        <w:t xml:space="preserve"> o pestaña es de los signos vitales del paciente, además de un par de antecedentes médicos importantes o al menos considerables.</w:t>
-      </w:r>
-    </w:p>
-    <w:p>
-      <w:pPr>
-        <w:jc w:val="both"/>
-      </w:pPr>
-      <w:r>
-        <w:t>Esto también queda a criterio del médico, ya que él es quien decide que quiere ver en esta pantalla, el objetivo es que puedan indicarme qué es lo que quieren ver acá y qué tipo de datos les son más útiles. Se debe definir rápidamente, con la intención de acelerar el proceso y evitar el re trabajo. Obviamente priorizar el hacer esto una sola vez y no iterar tantas veces en esta pantalla.</w:t>
-      </w:r>
-    </w:p>
-    <w:p>
-      <w:pPr>
-        <w:jc w:val="both"/>
-      </w:pPr>
+        <w:t>Esta pantalla</w:t>
+      </w:r>
+      <w:r>
+        <w:t xml:space="preserve"> es la ‘hoja en blanco’ sobre la que hemos conversado. Como se ve en la imagen, es posible ingresar texto de manera libre para algún antecedente o detalle del paciente. Lo mismo que para lo demás, es importante que se pueda determinar qué es lo que se verá acá. Si hay algún detalle o algo que integrar / eliminar, es necesario que me lo comenten y que quede establecido.</w:t>
+      </w:r>
     </w:p>
     <w:p>
       <w:pPr>
@@ -328,10 +331,10 @@
         </w:rPr>
         <w:lastRenderedPageBreak/>
         <w:drawing>
-          <wp:inline distT="0" distB="0" distL="0" distR="0" wp14:anchorId="238941C5" wp14:editId="235F2782">
-            <wp:extent cx="5612130" cy="3155315"/>
-            <wp:effectExtent l="0" t="0" r="7620" b="6985"/>
-            <wp:docPr id="1205761320" name="Imagen 1"/>
+          <wp:inline distT="0" distB="0" distL="0" distR="0" wp14:anchorId="4CF2E5A5" wp14:editId="219DF8B8">
+            <wp:extent cx="5612130" cy="2560320"/>
+            <wp:effectExtent l="0" t="0" r="7620" b="0"/>
+            <wp:docPr id="1481626785" name="Imagen 1"/>
             <wp:cNvGraphicFramePr>
               <a:graphicFrameLocks xmlns:a="http://schemas.openxmlformats.org/drawingml/2006/main" noChangeAspect="1"/>
             </wp:cNvGraphicFramePr>
@@ -339,7 +342,7 @@
               <a:graphicData uri="http://schemas.openxmlformats.org/drawingml/2006/picture">
                 <pic:pic xmlns:pic="http://schemas.openxmlformats.org/drawingml/2006/picture">
                   <pic:nvPicPr>
-                    <pic:cNvPr id="1205761320" name=""/>
+                    <pic:cNvPr id="1481626785" name=""/>
                     <pic:cNvPicPr/>
                   </pic:nvPicPr>
                   <pic:blipFill>
@@ -351,7 +354,7 @@
                   <pic:spPr>
                     <a:xfrm>
                       <a:off x="0" y="0"/>
-                      <a:ext cx="5612130" cy="3155315"/>
+                      <a:ext cx="5612130" cy="2560320"/>
                     </a:xfrm>
                     <a:prstGeom prst="rect">
                       <a:avLst/>
@@ -369,30 +372,22 @@
         <w:jc w:val="both"/>
       </w:pPr>
       <w:r>
-        <w:t>La tercera pestaña es bastante importante y aún no logro desarrollarla porque me quedan ciertas dudas. Por el momento lo dejé así ya que puedo seguir avanzando con otras cosas de la aplicación. Acá es necesario que me den más información, lo que más puedan a detallarme, ya que me gustaría consolidarlo. Como les explicaba, pueden indicarme que hacer en esta pantalla y yo la puedo ir desarrollando, así para cuando logremos reunirnos pueda tener un avance más sólido. Insisto en que esta pantalla es importante y también debe quedar bien definido que se quiere ver acá. Obviamente tiene un campo de observaciones donde se puede ingresar texto que el doctor estime conveniente.</w:t>
-      </w:r>
-    </w:p>
-    <w:p>
-      <w:pPr>
-        <w:jc w:val="both"/>
-      </w:pPr>
-    </w:p>
-    <w:p>
-      <w:pPr>
-        <w:jc w:val="both"/>
-      </w:pPr>
-    </w:p>
-    <w:p>
+        <w:t>Esta es la pestaña de exámenes. Se listan los exámenes asociados al paciente y tiene un botón que permite ver más detalles del examen, donde se podrá asignar si es que está normal o alterado o simplemente no se ha evaluado, como se ve a continuación.</w:t>
+      </w:r>
+    </w:p>
+    <w:p>
+      <w:pPr>
+        <w:jc w:val="both"/>
+      </w:pPr>
       <w:r>
         <w:rPr>
           <w:noProof/>
         </w:rPr>
-        <w:lastRenderedPageBreak/>
         <w:drawing>
-          <wp:inline distT="0" distB="0" distL="0" distR="0" wp14:anchorId="4F3220E3" wp14:editId="4A90D1E7">
-            <wp:extent cx="5612130" cy="3155315"/>
-            <wp:effectExtent l="0" t="0" r="7620" b="6985"/>
-            <wp:docPr id="2071289088" name="Imagen 1"/>
+          <wp:inline distT="0" distB="0" distL="0" distR="0" wp14:anchorId="5E6565C5" wp14:editId="124B13D8">
+            <wp:extent cx="5612130" cy="2561590"/>
+            <wp:effectExtent l="0" t="0" r="7620" b="0"/>
+            <wp:docPr id="72459108" name="Imagen 1"/>
             <wp:cNvGraphicFramePr>
               <a:graphicFrameLocks xmlns:a="http://schemas.openxmlformats.org/drawingml/2006/main" noChangeAspect="1"/>
             </wp:cNvGraphicFramePr>
@@ -400,7 +395,7 @@
               <a:graphicData uri="http://schemas.openxmlformats.org/drawingml/2006/picture">
                 <pic:pic xmlns:pic="http://schemas.openxmlformats.org/drawingml/2006/picture">
                   <pic:nvPicPr>
-                    <pic:cNvPr id="2071289088" name=""/>
+                    <pic:cNvPr id="72459108" name=""/>
                     <pic:cNvPicPr/>
                   </pic:nvPicPr>
                   <pic:blipFill>
@@ -412,7 +407,7 @@
                   <pic:spPr>
                     <a:xfrm>
                       <a:off x="0" y="0"/>
-                      <a:ext cx="5612130" cy="3155315"/>
+                      <a:ext cx="5612130" cy="2561590"/>
                     </a:xfrm>
                     <a:prstGeom prst="rect">
                       <a:avLst/>
@@ -430,22 +425,37 @@
         <w:jc w:val="both"/>
       </w:pPr>
       <w:r>
-        <w:t>La cuarta pantalla es la ‘hoja en blanco’ sobre la que hemos conversado. Como se ve en la imagen, es posible ingresar texto de manera libre para algún antecedente o detalle del paciente. Lo mismo que para lo demás</w:t>
-      </w:r>
-      <w:r>
-        <w:t>, es importante que se pueda determinar qué es lo que se verá acá. Si hay algún detalle o algo que integrar / eliminar, es necesario que me lo comenten y que quede establecido.</w:t>
-      </w:r>
-    </w:p>
-    <w:p>
+        <w:t>En esta ventana desplegable, que se levanta luego de hacer clic en el botón ‘Ver Pruebas’, se tiene un detalle de las pruebas realizadas para el examen. Se tiene una lista desplegable con distintas opciones. En este momento se tienen tres opciones posibles, detalladas en los comentarios. Las posibles respuestas son ‘Sin Evaluar’, ‘Normal’ y ‘Alterado’. Además, se tiene un campo para agregar observaciones extra.</w:t>
+      </w:r>
+    </w:p>
+    <w:p>
+      <w:pPr>
+        <w:jc w:val="both"/>
+      </w:pPr>
+      <w:r>
+        <w:t>Por el momento se tienen dos exámenes en la base de datos, el de Altura Física y el de Espacio Confinado. Obviamente, es posible integrar más en la base de datos para tener en la aplicación. El de Altura tiene esos tres campos a evaluar y el de Espacio Confinado tiene los mismos pero se le agrega el de Espirometría.</w:t>
+      </w:r>
+    </w:p>
+    <w:p>
+      <w:pPr>
+        <w:jc w:val="both"/>
+      </w:pPr>
+    </w:p>
+    <w:p/>
+    <w:p/>
+    <w:p>
+      <w:pPr>
+        <w:jc w:val="both"/>
+      </w:pPr>
       <w:r>
         <w:rPr>
           <w:noProof/>
         </w:rPr>
         <w:drawing>
-          <wp:inline distT="0" distB="0" distL="0" distR="0" wp14:anchorId="6E074126" wp14:editId="324FDE35">
-            <wp:extent cx="5612130" cy="3155315"/>
-            <wp:effectExtent l="0" t="0" r="7620" b="6985"/>
-            <wp:docPr id="854422689" name="Imagen 1"/>
+          <wp:inline distT="0" distB="0" distL="0" distR="0" wp14:anchorId="3A716EBA" wp14:editId="3F9B3FCF">
+            <wp:extent cx="5612130" cy="2555875"/>
+            <wp:effectExtent l="0" t="0" r="7620" b="0"/>
+            <wp:docPr id="91222130" name="Imagen 1"/>
             <wp:cNvGraphicFramePr>
               <a:graphicFrameLocks xmlns:a="http://schemas.openxmlformats.org/drawingml/2006/main" noChangeAspect="1"/>
             </wp:cNvGraphicFramePr>
@@ -453,7 +463,7 @@
               <a:graphicData uri="http://schemas.openxmlformats.org/drawingml/2006/picture">
                 <pic:pic xmlns:pic="http://schemas.openxmlformats.org/drawingml/2006/picture">
                   <pic:nvPicPr>
-                    <pic:cNvPr id="854422689" name=""/>
+                    <pic:cNvPr id="91222130" name=""/>
                     <pic:cNvPicPr/>
                   </pic:nvPicPr>
                   <pic:blipFill>
@@ -465,7 +475,7 @@
                   <pic:spPr>
                     <a:xfrm>
                       <a:off x="0" y="0"/>
-                      <a:ext cx="5612130" cy="3155315"/>
+                      <a:ext cx="5612130" cy="2555875"/>
                     </a:xfrm>
                     <a:prstGeom prst="rect">
                       <a:avLst/>
@@ -483,15 +493,180 @@
         <w:jc w:val="both"/>
       </w:pPr>
       <w:r>
-        <w:t xml:space="preserve">Similarmente acá, se tiene una caja de texto para las interconsultas. No hay mucho más que explicar en esta pantalla. Por otro lado, se tiene un botón llamado ‘Reporte Paciente’, que permitirá descargar un archivo PDF con toda la información ya vista del paciente y lo que se agregó en esta pantalla. Esta </w:t>
-      </w:r>
-      <w:r>
+        <w:t>Esta pestaña es la de Interconsultas. Según lo visto en los comentarios, acá se debe tener un ingreso del médico que indica hacia donde se debe derivar el paciente en caso de alguna alteración o dependiendo del criterio del médico. Se tiene un campo donde se puede seleccionar la especialidad hacia donde se debe derivar al paciente, la patología detectada e incluso se tiene una fecha de interconsulta.</w:t>
+      </w:r>
+    </w:p>
+    <w:p>
+      <w:pPr>
+        <w:jc w:val="both"/>
+      </w:pPr>
+      <w:r>
+        <w:t>Estos campos deben ser correctamente revisados al detalle y modificados en caso de ser necesario. Considerar que se pueden agregar, quitar y modificar campos a criterio del médico.</w:t>
+      </w:r>
+    </w:p>
+    <w:p>
+      <w:pPr>
+        <w:jc w:val="both"/>
+      </w:pPr>
+      <w:r>
+        <w:t>Finalmente, se tiene un botón de ‘Guardar Interconsulta’ que permitirá registrar en la base de datos la interconsulta, con el objetivo de tener un registro histórico del paciente.</w:t>
+      </w:r>
+    </w:p>
+    <w:p>
+      <w:pPr>
+        <w:jc w:val="both"/>
+      </w:pPr>
+    </w:p>
+    <w:p>
+      <w:pPr>
+        <w:jc w:val="both"/>
+      </w:pPr>
+    </w:p>
+    <w:p>
+      <w:pPr>
+        <w:jc w:val="both"/>
+      </w:pPr>
+      <w:r>
+        <w:rPr>
+          <w:noProof/>
+        </w:rPr>
         <w:lastRenderedPageBreak/>
-        <w:t>funcionalidad está en desarrollo aún, pero va muy bien encaminada. Hasta el momento es necesario que se evalúe este flujo y se pueda validar.</w:t>
-      </w:r>
-      <w:r>
-        <w:t xml:space="preserve"> </w:t>
-      </w:r>
+        <w:drawing>
+          <wp:inline distT="0" distB="0" distL="0" distR="0" wp14:anchorId="6AEB58F6" wp14:editId="0CF2F074">
+            <wp:extent cx="5612130" cy="2544445"/>
+            <wp:effectExtent l="0" t="0" r="7620" b="8255"/>
+            <wp:docPr id="2027215260" name="Imagen 1"/>
+            <wp:cNvGraphicFramePr>
+              <a:graphicFrameLocks xmlns:a="http://schemas.openxmlformats.org/drawingml/2006/main" noChangeAspect="1"/>
+            </wp:cNvGraphicFramePr>
+            <a:graphic xmlns:a="http://schemas.openxmlformats.org/drawingml/2006/main">
+              <a:graphicData uri="http://schemas.openxmlformats.org/drawingml/2006/picture">
+                <pic:pic xmlns:pic="http://schemas.openxmlformats.org/drawingml/2006/picture">
+                  <pic:nvPicPr>
+                    <pic:cNvPr id="2027215260" name=""/>
+                    <pic:cNvPicPr/>
+                  </pic:nvPicPr>
+                  <pic:blipFill>
+                    <a:blip r:embed="rId12"/>
+                    <a:stretch>
+                      <a:fillRect/>
+                    </a:stretch>
+                  </pic:blipFill>
+                  <pic:spPr>
+                    <a:xfrm>
+                      <a:off x="0" y="0"/>
+                      <a:ext cx="5612130" cy="2544445"/>
+                    </a:xfrm>
+                    <a:prstGeom prst="rect">
+                      <a:avLst/>
+                    </a:prstGeom>
+                  </pic:spPr>
+                </pic:pic>
+              </a:graphicData>
+            </a:graphic>
+          </wp:inline>
+        </w:drawing>
+      </w:r>
+    </w:p>
+    <w:p>
+      <w:pPr>
+        <w:jc w:val="both"/>
+      </w:pPr>
+      <w:r>
+        <w:t>Por último, se tiene una última pestaña que muestra un pequeño resumen del paciente, con el objetivo de validar la información de toda esta página. Además, tiene un campo con las advertencias descritas en el documento de comentarios.</w:t>
+      </w:r>
+    </w:p>
+    <w:p>
+      <w:pPr>
+        <w:jc w:val="both"/>
+      </w:pPr>
+      <w:r>
+        <w:rPr>
+          <w:noProof/>
+        </w:rPr>
+        <w:drawing>
+          <wp:inline distT="0" distB="0" distL="0" distR="0" wp14:anchorId="6F50C364" wp14:editId="62DAF50F">
+            <wp:extent cx="5612130" cy="1960880"/>
+            <wp:effectExtent l="0" t="0" r="7620" b="1270"/>
+            <wp:docPr id="2008230837" name="Imagen 1"/>
+            <wp:cNvGraphicFramePr>
+              <a:graphicFrameLocks xmlns:a="http://schemas.openxmlformats.org/drawingml/2006/main" noChangeAspect="1"/>
+            </wp:cNvGraphicFramePr>
+            <a:graphic xmlns:a="http://schemas.openxmlformats.org/drawingml/2006/main">
+              <a:graphicData uri="http://schemas.openxmlformats.org/drawingml/2006/picture">
+                <pic:pic xmlns:pic="http://schemas.openxmlformats.org/drawingml/2006/picture">
+                  <pic:nvPicPr>
+                    <pic:cNvPr id="2008230837" name=""/>
+                    <pic:cNvPicPr/>
+                  </pic:nvPicPr>
+                  <pic:blipFill>
+                    <a:blip r:embed="rId13"/>
+                    <a:stretch>
+                      <a:fillRect/>
+                    </a:stretch>
+                  </pic:blipFill>
+                  <pic:spPr>
+                    <a:xfrm>
+                      <a:off x="0" y="0"/>
+                      <a:ext cx="5612130" cy="1960880"/>
+                    </a:xfrm>
+                    <a:prstGeom prst="rect">
+                      <a:avLst/>
+                    </a:prstGeom>
+                  </pic:spPr>
+                </pic:pic>
+              </a:graphicData>
+            </a:graphic>
+          </wp:inline>
+        </w:drawing>
+      </w:r>
+    </w:p>
+    <w:p>
+      <w:pPr>
+        <w:jc w:val="both"/>
+      </w:pPr>
+      <w:r>
+        <w:t>Luego, en la misma pestaña, se tiene un campo importante que indica si el paciente está apto o no para el trabajo solicitado. Esto es a criterio del médico, evidentemente. Por último, un campo de observaciones en caso de no estar apto para el trabajo o para los comentarios que se quieran realizar y un botón que permite generar el reporte en formato PDF del resumen del paciente y a la vez, enviar un correo electrónico a los receptores que sean necesarios y requeridos para esta aplicación.</w:t>
+      </w:r>
+    </w:p>
+    <w:p>
+      <w:pPr>
+        <w:jc w:val="both"/>
+      </w:pPr>
+      <w:r>
+        <w:t xml:space="preserve">El informe médico en formato PDF está en desarrollo, aún no se desarrolla por completo esta funcionalidad ya que depende directamente de que todo lo que está hasta este punto del documento esté correcto y bien definido, sino no tiene sentido desarrollar un informe si los datos no son los correctos. </w:t>
+      </w:r>
+    </w:p>
+    <w:p>
+      <w:pPr>
+        <w:jc w:val="both"/>
+      </w:pPr>
+      <w:r>
+        <w:t>Es por esto que es necesario una realimentación importante y detallada de lo que existe hasta el momento.</w:t>
+      </w:r>
+    </w:p>
+    <w:p>
+      <w:pPr>
+        <w:jc w:val="both"/>
+      </w:pPr>
+      <w:r>
+        <w:t>Por otro lado, la mensajería mediante correo debe establecer hacia quienes irán los emails, y desde donde serán enviados.</w:t>
+      </w:r>
+    </w:p>
+    <w:p>
+      <w:pPr>
+        <w:jc w:val="both"/>
+      </w:pPr>
+    </w:p>
+    <w:p>
+      <w:pPr>
+        <w:jc w:val="both"/>
+      </w:pPr>
+    </w:p>
+    <w:p>
+      <w:pPr>
+        <w:jc w:val="both"/>
+      </w:pPr>
     </w:p>
     <w:p>
       <w:pPr>
@@ -517,7 +692,7 @@
                     <pic:cNvPicPr/>
                   </pic:nvPicPr>
                   <pic:blipFill>
-                    <a:blip r:embed="rId12"/>
+                    <a:blip r:embed="rId14"/>
                     <a:stretch>
                       <a:fillRect/>
                     </a:stretch>
@@ -562,7 +737,7 @@
                     <pic:cNvPicPr/>
                   </pic:nvPicPr>
                   <pic:blipFill>
-                    <a:blip r:embed="rId13"/>
+                    <a:blip r:embed="rId15"/>
                     <a:stretch>
                       <a:fillRect/>
                     </a:stretch>
@@ -588,7 +763,11 @@
         <w:jc w:val="both"/>
       </w:pPr>
       <w:r>
-        <w:t>Esta pantalla es para ingresar un nuevo paciente. Por el momento lo hace el único usuario que tiene permisos de administrador, también se debe dejar establecido quién es quien puede ingresar pacientes (me refiero a que rol de usuario). Se tiene bien definido donde van los datos personales, signos vitales, entre otra información. Una vez se guarda el paciente, este se almacena en la base de datos y se muestra inmediatamente en la tabla de pacientes.</w:t>
+        <w:t xml:space="preserve">Esta pantalla es para ingresar un nuevo paciente. Por el momento lo hace el único usuario que tiene permisos de administrador, también se debe dejar establecido quién es quien puede ingresar pacientes (me refiero a que rol de usuario). Se tiene bien definido donde van los datos personales, </w:t>
+      </w:r>
+      <w:r>
+        <w:lastRenderedPageBreak/>
+        <w:t>signos vitales, entre otra información. Una vez se guarda el paciente, este se almacena en la base de datos y se muestra inmediatamente en la tabla de pacientes.</w:t>
       </w:r>
     </w:p>
     <w:p>
@@ -607,7 +786,7 @@
 </file>
 
 <file path=word/styles.xml><?xml version="1.0" encoding="utf-8"?>
-<w:styles xmlns:mc="http://schemas.openxmlformats.org/markup-compatibility/2006" xmlns:r="http://schemas.openxmlformats.org/officeDocument/2006/relationships" xmlns:w="http://schemas.openxmlformats.org/wordprocessingml/2006/main" xmlns:w14="http://schemas.microsoft.com/office/word/2010/wordml" xmlns:w15="http://schemas.microsoft.com/office/word/2012/wordml" xmlns:w16cex="http://schemas.microsoft.com/office/word/2018/wordml/cex" xmlns:w16cid="http://schemas.microsoft.com/office/word/2016/wordml/cid" xmlns:w16="http://schemas.microsoft.com/office/word/2018/wordml" xmlns:w16du="http://schemas.microsoft.com/office/word/2023/wordml/word16du" xmlns:w16sdtdh="http://schemas.microsoft.com/office/word/2020/wordml/sdtdatahash" xmlns:w16se="http://schemas.microsoft.com/office/word/2015/wordml/symex" mc:Ignorable="w14 w15 w16se w16cid w16 w16cex w16sdtdh w16du">
+<w:styles xmlns:mc="http://schemas.openxmlformats.org/markup-compatibility/2006" xmlns:r="http://schemas.openxmlformats.org/officeDocument/2006/relationships" xmlns:w="http://schemas.openxmlformats.org/wordprocessingml/2006/main" xmlns:w14="http://schemas.microsoft.com/office/word/2010/wordml" xmlns:w15="http://schemas.microsoft.com/office/word/2012/wordml" xmlns:w16cex="http://schemas.microsoft.com/office/word/2018/wordml/cex" xmlns:w16cid="http://schemas.microsoft.com/office/word/2016/wordml/cid" xmlns:w16="http://schemas.microsoft.com/office/word/2018/wordml" xmlns:w16du="http://schemas.microsoft.com/office/word/2023/wordml/word16du" xmlns:w16sdtdh="http://schemas.microsoft.com/office/word/2020/wordml/sdtdatahash" xmlns:w16sdtfl="http://schemas.microsoft.com/office/word/2024/wordml/sdtformatlock" xmlns:w16se="http://schemas.microsoft.com/office/word/2015/wordml/symex" mc:Ignorable="w14 w15 w16se w16cid w16 w16cex w16sdtdh w16sdtfl w16du">
   <w:docDefaults>
     <w:rPrDefault>
       <w:rPr>

</xml_diff>